<commit_message>
Entry #048: ADR-047 inference architecture (16 GB host) DECIDED; DATA_BOUNDARIES v2.1; §8.3 hook live-verified + run log; step 1 (cloud path disabled, tier relabel); step 2 (generator v9 guards, /agent inference lock); findings F11-F13
Co-Authored-By: Claude Opus 5.5 <noreply@anthropic.com>
</commit_message>
<xml_diff>
--- a/ADR_040.docx
+++ b/ADR_040.docx
@@ -255,7 +255,7 @@
                 <w:sz w:val="20"/>
                 <w:szCs w:val="20"/>
               </w:rPr>
-              <w:t xml:space="preserve">DECIDED — April 19, 2026. AMENDED September 20, 2026 by ADR-045 (enforcement model; third Section 2 breach). The boundary policy stands unchanged in intent; ADR-045 addresses the fact that nothing enforces it at the point a command runs.</w:t>
+              <w:t xml:space="preserve">DECIDED — April 19, 2026. AMENDED September 20, 2026 by ADR-045 (enforcement model; third Section 2 breach). The boundary policy stands unchanged in intent; ADR-045 addresses the fact that nothing enforces it at the point a command runs. AMENDED September 29, 2026 by ADR-047 §9: Section 3.1 now also permits write to two named LaunchAgent files (com.openclaw.backup.plist — live since May 17, 2026, previously unlisted — and com.openclaw.ollama-env.plist), read-only ~/.ollama/logs/server.log, and states ~/.ollama/models is reached only via the ollama CLI/API. See DATA_BOUNDARIES.md v2.1.</w:t>
             </w:r>
           </w:p>
         </w:tc>
@@ -3173,7 +3173,7 @@
           <w:sz w:val="20"/>
           <w:szCs w:val="20"/>
         </w:rPr>
-        <w:t xml:space="preserve">ADR-040 v1.1 — Drafted April 19, 2026 — Amended September 20, 2026 (ADR-045) — Status DECIDED</w:t>
+        <w:t xml:space="preserve">ADR-040 v1.1 — Drafted April 19, 2026 — Amended September 20, 2026 (ADR-045) and September 29, 2026 (ADR-047 §9) — Status DECIDED</w:t>
       </w:r>
     </w:p>
     <w:sectPr>

</xml_diff>

<commit_message>
Entry #052: F17 closed (Docker default-socket and privileged-port options off; ordinary reboot, no password prompt); startup checks pass; DATA_BOUNDARIES v2.2 / ADR-040 v1.2 host-maintenance look-only listing (operator decision); sixth §2 breach disclosed
Co-Authored-By: Claude Opus 5.5 <noreply@anthropic.com>
</commit_message>
<xml_diff>
--- a/ADR_040.docx
+++ b/ADR_040.docx
@@ -255,7 +255,7 @@
                 <w:sz w:val="20"/>
                 <w:szCs w:val="20"/>
               </w:rPr>
-              <w:t xml:space="preserve">DECIDED — April 19, 2026. AMENDED September 20, 2026 by ADR-045 (enforcement model; third Section 2 breach). The boundary policy stands unchanged in intent; ADR-045 addresses the fact that nothing enforces it at the point a command runs. AMENDED September 29, 2026 by ADR-047 §9: Section 3.1 now also permits write to two named LaunchAgent files (com.openclaw.backup.plist — live since May 17, 2026, previously unlisted — and com.openclaw.ollama-env.plist), read-only ~/.ollama/logs/server.log, and states ~/.ollama/models is reached only via the ollama CLI/API. See DATA_BOUNDARIES.md v2.1.</w:t>
+              <w:t xml:space="preserve">DECIDED — April 19, 2026. AMENDED September 20, 2026 by ADR-045 (enforcement model; third Section 2 breach). The boundary policy stands unchanged in intent; ADR-045 addresses the fact that nothing enforces it at the point a command runs. AMENDED September 29, 2026 by ADR-047 §9: Section 3.1 now also permits write to two named LaunchAgent files (com.openclaw.backup.plist — live since May 17, 2026, previously unlisted — and com.openclaw.ollama-env.plist), read-only ~/.ollama/logs/server.log, and states ~/.ollama/models is reached only via the ollama CLI/API. See DATA_BOUNDARIES.md v2.1. AMENDED October 2, 2026 by operator decision (changelog Entry #052): Section 3.1 now also permits look-only access for host maintenance — see the note under the Section 3.1 table and DATA_BOUNDARIES.md v2.2.</w:t>
             </w:r>
           </w:p>
         </w:tc>
@@ -1045,6 +1045,45 @@
     <w:p>
       <w:r>
         <w:t xml:space="preserve"/>
+      </w:r>
+    </w:p>
+    <w:p>
+      <w:pPr>
+        <w:spacing w:after="160"/>
+      </w:pPr>
+      <w:r>
+        <w:rPr>
+          <w:rFonts w:ascii="Arial" w:cs="Arial" w:eastAsia="Arial" w:hAnsi="Arial"/>
+          <w:sz w:val="20"/>
+          <w:szCs w:val="20"/>
+        </w:rPr>
+        <w:t xml:space="preserve">Amendment — October 2, 2026 (operator decision, changelog Entry #052; DATA_BOUNDARIES.md v2.2). Trigger: the fifth and sixth Section 2 breaches were both host-maintenance diagnosis (Homebrew, Ollama, Docker) reaching paths this section did not list. The following are added to the permitted set, for looking only:</w:t>
+      </w:r>
+    </w:p>
+    <w:p>
+      <w:pPr>
+        <w:spacing w:after="160"/>
+      </w:pPr>
+      <w:r>
+        <w:rPr>
+          <w:rFonts w:ascii="Arial" w:cs="Arial" w:eastAsia="Arial" w:hAnsi="Arial"/>
+          <w:sz w:val="20"/>
+          <w:szCs w:val="20"/>
+        </w:rPr>
+        <w:t xml:space="preserve">(1) /Library/PrivilegedHelperTools/com.docker.socket and com.docker.vmnetd, and /Library/LaunchDaemons/com.docker.socket.plist and com.docker.vmnetd.plist — existence, owner and date only, these four files by explicit path; no contents, no folder listing. (2) /var/run/docker.sock and ~/.docker/run/docker.sock — existence and link target only. (3) ~/.docker/bin — list and execute. (4) /Applications/Docker.app and /Applications/Ollama.app — existence and version only, by explicit path. (5) /opt/homebrew — no direct access; reached only through the brew command. (6) ~/.zprofile — read only, this one file. (7) ~/.ollama/models/manifests — read only; the rest of ~/.ollama/models, including the weight files, remains no direct access, and nothing under it is written, moved or deleted except by Ollama. (8) ~/Library/Python — list and read.</w:t>
+      </w:r>
+    </w:p>
+    <w:p>
+      <w:pPr>
+        <w:spacing w:after="160"/>
+      </w:pPr>
+      <w:r>
+        <w:rPr>
+          <w:rFonts w:ascii="Arial" w:cs="Arial" w:eastAsia="Arial" w:hAnsi="Arial"/>
+          <w:sz w:val="20"/>
+          <w:szCs w:val="20"/>
+        </w:rPr>
+        <w:t xml:space="preserve">Limits: none of these rows permits a change. Every install, uninstall, brew autoremove, settings change or edit to ~/.zprofile needs the operator’s approval for that action. Wildcards and folder listings remain prohibited except in items (3), (7) and (8). Commands that report system state without reading user folders (sw_vers, sysctl, uptime, last, pmset -g, launchctl list / print) are not filesystem access under this ADR. Sensitive-data assessment (Section 6): none of the listed locations holds personal data, except that ~/.zprofile is the operator’s shell configuration and is therefore limited to read-only access to the single file. The Section 3.2 row for ~/Library now also excepts ~/Library/Python.</w:t>
       </w:r>
     </w:p>
     <w:p>
@@ -3173,7 +3212,7 @@
           <w:sz w:val="20"/>
           <w:szCs w:val="20"/>
         </w:rPr>
-        <w:t xml:space="preserve">ADR-040 v1.1 — Drafted April 19, 2026 — Amended September 20, 2026 (ADR-045) and September 29, 2026 (ADR-047 §9) — Status DECIDED</w:t>
+        <w:t xml:space="preserve">ADR-040 v1.2 — Drafted April 19, 2026 — Amended September 20, 2026 (ADR-045), September 29, 2026 (ADR-047 §9) and October 2, 2026 (operator decision, Entry #052) — Status DECIDED</w:t>
       </w:r>
     </w:p>
     <w:sectPr>

</xml_diff>